<commit_message>
Add Pricing Structure question (P7.Q4) to client onboarding templates
Adds a new question to both the DOCX and XLSX onboarding templates asking clients to describe their pricing structure, tiers/packages, and pricing rationale. Inserted as P7.Q4 in Pillar 7 (Revenue Model and Growth Trajectory). Updates question count from 23 to 24 across both files, including the completion formula and conditional formatting in the XLSX.

Co-Authored-By: Claude Sonnet 4.6 <noreply@anthropic.com>
</commit_message>
<xml_diff>
--- a/public/CinaTech_Client_Onboarding_Template.docx
+++ b/public/CinaTech_Client_Onboarding_Template.docx
@@ -56,7 +56,7 @@
           <w:sz w:val="22"/>
           <w:szCs w:val="22"/>
         </w:rPr>
-        <w:t xml:space="preserve">Complete all 23 questions before submitting.</w:t>
+        <w:t xml:space="preserve">Complete all 24 questions before submitting.</w:t>
       </w:r>
     </w:p>
     <w:p>
@@ -2559,6 +2559,128 @@
                 <w:szCs w:val="22"/>
               </w:rPr>
               <w:t xml:space="preserve">Contract type / average length in months / monthly churn % or estimate</w:t>
+            </w:r>
+          </w:p>
+          <w:p>
+            <w:pPr>
+              <w:spacing w:after="0" w:before="0"/>
+            </w:pPr>
+          </w:p>
+          <w:p>
+            <w:pPr>
+              <w:spacing w:after="0" w:before="0"/>
+            </w:pPr>
+          </w:p>
+          <w:p>
+            <w:pPr>
+              <w:spacing w:after="240" w:before="0"/>
+            </w:pPr>
+          </w:p>
+        </w:tc>
+      </w:tr>
+    </w:tbl>
+    <w:p>
+      <w:pPr>
+        <w:spacing w:after="160" w:before="0"/>
+      </w:pPr>
+    </w:p>
+    <w:p>
+      <w:pPr>
+        <w:spacing w:after="80" w:before="280"/>
+      </w:pPr>
+      <w:r>
+        <w:rPr>
+          <w:rFonts w:ascii="Arial" w:cs="Arial" w:eastAsia="Arial" w:hAnsi="Arial"/>
+          <w:b/>
+          <w:bCs/>
+          <w:color w:val="2E74B5"/>
+          <w:sz w:val="24"/>
+          <w:szCs w:val="24"/>
+        </w:rPr>
+        <w:t xml:space="preserve">P7.Q4  </w:t>
+      </w:r>
+      <w:r>
+        <w:rPr>
+          <w:rFonts w:ascii="Arial" w:cs="Arial" w:eastAsia="Arial" w:hAnsi="Arial"/>
+          <w:b/>
+          <w:bCs/>
+          <w:color w:val="000000"/>
+          <w:sz w:val="24"/>
+          <w:szCs w:val="24"/>
+        </w:rPr>
+        <w:t xml:space="preserve">How is your service or product currently priced? Please include your pricing structure, any tiers or packages you offer, and how you arrived at these prices (e.g. cost-plus, value-based, competitor benchmarking).</w:t>
+      </w:r>
+    </w:p>
+    <w:p>
+      <w:pPr>
+        <w:spacing w:after="100" w:before="0"/>
+      </w:pPr>
+      <w:r>
+        <w:rPr>
+          <w:rFonts w:ascii="Arial" w:cs="Arial" w:eastAsia="Arial" w:hAnsi="Arial"/>
+          <w:b/>
+          <w:bCs/>
+          <w:i/>
+          <w:iCs/>
+          <w:color w:val="595959"/>
+          <w:sz w:val="20"/>
+          <w:szCs w:val="20"/>
+        </w:rPr>
+        <w:t xml:space="preserve">Guidance:  </w:t>
+      </w:r>
+      <w:r>
+        <w:rPr>
+          <w:rFonts w:ascii="Arial" w:cs="Arial" w:eastAsia="Arial" w:hAnsi="Arial"/>
+          <w:i/>
+          <w:iCs/>
+          <w:color w:val="595959"/>
+          <w:sz w:val="20"/>
+          <w:szCs w:val="20"/>
+        </w:rPr>
+        <w:t xml:space="preserve">Include specific price points or ranges if possible. Note whether prices are fixed or negotiated, and whether they differ by client type or volume.</w:t>
+      </w:r>
+    </w:p>
+    <w:tbl>
+      <w:tblPr>
+        <w:tblW w:type="dxa" w:w="9360"/>
+        <w:tblBorders>
+          <w:top w:val="single" w:color="auto" w:sz="4"/>
+          <w:left w:val="single" w:color="auto" w:sz="4"/>
+          <w:bottom w:val="single" w:color="auto" w:sz="4"/>
+          <w:right w:val="single" w:color="auto" w:sz="4"/>
+          <w:insideH w:val="single" w:color="auto" w:sz="4"/>
+          <w:insideV w:val="single" w:color="auto" w:sz="4"/>
+        </w:tblBorders>
+      </w:tblPr>
+      <w:tblGrid>
+        <w:gridCol w:w="9360"/>
+      </w:tblGrid>
+      <w:tr>
+        <w:tc>
+          <w:tcPr>
+            <w:tcW w:type="dxa" w:w="9360"/>
+            <w:shd w:fill="F2F2F2" w:color="auto" w:val="clear"/>
+            <w:tcMar>
+              <w:top w:type="dxa" w:w="80"/>
+              <w:left w:type="dxa" w:w="120"/>
+              <w:bottom w:type="dxa" w:w="80"/>
+              <w:right w:type="dxa" w:w="120"/>
+            </w:tcMar>
+          </w:tcPr>
+          <w:p>
+            <w:pPr>
+              <w:spacing w:after="0" w:before="0"/>
+            </w:pPr>
+            <w:r>
+              <w:rPr>
+                <w:rFonts w:ascii="Arial" w:cs="Arial" w:eastAsia="Arial" w:hAnsi="Arial"/>
+                <w:i/>
+                <w:iCs/>
+                <w:color w:val="A6A6A6"/>
+                <w:sz w:val="22"/>
+                <w:szCs w:val="22"/>
+              </w:rPr>
+              <w:t xml:space="preserve">Pricing model / tier or package names and prices / rationale for pricing approach</w:t>
             </w:r>
           </w:p>
           <w:p>

</xml_diff>